<commit_message>
feat: add leadership proof images with lightbox; fix HackJKLU v5.0 year to March 2026
</commit_message>
<xml_diff>
--- a/server/files/Aryan_Chaturvedi_Resume.docx
+++ b/server/files/Aryan_Chaturvedi_Resume.docx
@@ -1145,7 +1145,7 @@
                 <w:sz w:val="21"/>
                 <w:szCs w:val="21"/>
               </w:rPr>
-              <w:t>Discipline Coordinator – College Hackathon</w:t>
+              <w:t>Discipline Coordinator – HackJKLU v5.0</w:t>
             </w:r>
           </w:p>
         </w:tc>
@@ -1169,7 +1169,7 @@
                 <w:sz w:val="21"/>
                 <w:szCs w:val="21"/>
               </w:rPr>
-              <w:t>2025</w:t>
+              <w:t>Mar 2026</w:t>
             </w:r>
           </w:p>
         </w:tc>

</xml_diff>